<commit_message>
feat: Introduce new modular system, OT reports, and engineer portal applications, integrate the 'get-shit-done' development framework, and restructure project documentation.
</commit_message>
<xml_diff>
--- a/apps/reportes-ot/scripts/word-to-protocol-json/ejemplos/QF7.0605.07 MP1100-1200-1220-1260-1290.docx
+++ b/apps/reportes-ot/scripts/word-to-protocol-json/ejemplos/QF7.0605.07 MP1100-1200-1220-1260-1290.docx
@@ -1,6 +1,6 @@
 
 <file path=word/document.xml><?xml version="1.0" encoding="utf-8"?>
-<w:document xmlns:wpc="http://schemas.microsoft.com/office/word/2010/wordprocessingCanvas" xmlns:cx="http://schemas.microsoft.com/office/drawing/2014/chartex" xmlns:cx1="http://schemas.microsoft.com/office/drawing/2015/9/8/chartex" xmlns:cx2="http://schemas.microsoft.com/office/drawing/2015/10/21/chartex" xmlns:cx3="http://schemas.microsoft.com/office/drawing/2016/5/9/chartex" xmlns:cx4="http://schemas.microsoft.com/office/drawing/2016/5/10/chartex" xmlns:cx5="http://schemas.microsoft.com/office/drawing/2016/5/11/chartex" xmlns:cx6="http://schemas.microsoft.com/office/drawing/2016/5/12/chartex" xmlns:cx7="http://schemas.microsoft.com/office/drawing/2016/5/13/chartex" xmlns:cx8="http://schemas.microsoft.com/office/drawing/2016/5/14/chartex" xmlns:mc="http://schemas.openxmlformats.org/markup-compatibility/2006" xmlns:aink="http://schemas.microsoft.com/office/drawing/2016/ink" xmlns:am3d="http://schemas.microsoft.com/office/drawing/2017/model3d" xmlns:o="urn:schemas-microsoft-com:office:office" xmlns:oel="http://schemas.microsoft.com/office/2019/extlst" xmlns:r="http://schemas.openxmlformats.org/officeDocument/2006/relationships" xmlns:m="http://schemas.openxmlformats.org/officeDocument/2006/math" xmlns:v="urn:schemas-microsoft-com:vml" xmlns:wp14="http://schemas.microsoft.com/office/word/2010/wordprocessingDrawing" xmlns:wp="http://schemas.openxmlformats.org/drawingml/2006/wordprocessingDrawing" xmlns:w10="urn:schemas-microsoft-com:office:word" xmlns:w="http://schemas.openxmlformats.org/wordprocessingml/2006/main" xmlns:w14="http://schemas.microsoft.com/office/word/2010/wordml" xmlns:w15="http://schemas.microsoft.com/office/word/2012/wordml" xmlns:w16cex="http://schemas.microsoft.com/office/word/2018/wordml/cex" xmlns:w16cid="http://schemas.microsoft.com/office/word/2016/wordml/cid" xmlns:w16="http://schemas.microsoft.com/office/word/2018/wordml" xmlns:w16du="http://schemas.microsoft.com/office/word/2023/wordml/word16du" xmlns:w16sdtdh="http://schemas.microsoft.com/office/word/2020/wordml/sdtdatahash" xmlns:w16sdtfl="http://schemas.microsoft.com/office/word/2024/wordml/sdtformatlock" xmlns:w16se="http://schemas.microsoft.com/office/word/2015/wordml/symex" xmlns:wpg="http://schemas.microsoft.com/office/word/2010/wordprocessingGroup" xmlns:wpi="http://schemas.microsoft.com/office/word/2010/wordprocessingInk" xmlns:wne="http://schemas.microsoft.com/office/word/2006/wordml" xmlns:wps="http://schemas.microsoft.com/office/word/2010/wordprocessingShape" mc:Ignorable="w14 w15 w16se w16cid w16 w16cex w16sdtdh w16sdtfl w16du wp14">
+<w:document xmlns:wpc="http://schemas.microsoft.com/office/word/2010/wordprocessingCanvas" xmlns:cx="http://schemas.microsoft.com/office/drawing/2014/chartex" xmlns:cx1="http://schemas.microsoft.com/office/drawing/2015/9/8/chartex" xmlns:cx2="http://schemas.microsoft.com/office/drawing/2015/10/21/chartex" xmlns:cx3="http://schemas.microsoft.com/office/drawing/2016/5/9/chartex" xmlns:cx4="http://schemas.microsoft.com/office/drawing/2016/5/10/chartex" xmlns:cx5="http://schemas.microsoft.com/office/drawing/2016/5/11/chartex" xmlns:cx6="http://schemas.microsoft.com/office/drawing/2016/5/12/chartex" xmlns:cx7="http://schemas.microsoft.com/office/drawing/2016/5/13/chartex" xmlns:cx8="http://schemas.microsoft.com/office/drawing/2016/5/14/chartex" xmlns:mc="http://schemas.openxmlformats.org/markup-compatibility/2006" xmlns:aink="http://schemas.microsoft.com/office/drawing/2016/ink" xmlns:am3d="http://schemas.microsoft.com/office/drawing/2017/model3d" xmlns:o="urn:schemas-microsoft-com:office:office" xmlns:r="http://schemas.openxmlformats.org/officeDocument/2006/relationships" xmlns:m="http://schemas.openxmlformats.org/officeDocument/2006/math" xmlns:v="urn:schemas-microsoft-com:vml" xmlns:wp14="http://schemas.microsoft.com/office/word/2010/wordprocessingDrawing" xmlns:wp="http://schemas.openxmlformats.org/drawingml/2006/wordprocessingDrawing" xmlns:w10="urn:schemas-microsoft-com:office:word" xmlns:w="http://schemas.openxmlformats.org/wordprocessingml/2006/main" xmlns:w14="http://schemas.microsoft.com/office/word/2010/wordml" xmlns:w15="http://schemas.microsoft.com/office/word/2012/wordml" xmlns:w16cex="http://schemas.microsoft.com/office/word/2018/wordml/cex" xmlns:w16cid="http://schemas.microsoft.com/office/word/2016/wordml/cid" xmlns:w16="http://schemas.microsoft.com/office/word/2018/wordml" xmlns:w16sdtdh="http://schemas.microsoft.com/office/word/2020/wordml/sdtdatahash" xmlns:w16se="http://schemas.microsoft.com/office/word/2015/wordml/symex" xmlns:wpg="http://schemas.microsoft.com/office/word/2010/wordprocessingGroup" xmlns:wpi="http://schemas.microsoft.com/office/word/2010/wordprocessingInk" xmlns:wne="http://schemas.microsoft.com/office/word/2006/wordml" xmlns:wps="http://schemas.microsoft.com/office/word/2010/wordprocessingShape" mc:Ignorable="w14 w15 w16se w16cid w16 w16cex w16sdtdh wp14">
   <w:body>
     <w:tbl>
       <w:tblPr>
@@ -137,6 +137,98 @@
               </w:rPr>
               <w:t xml:space="preserve"> Packard          </w:t>
             </w:r>
+            <w:r>
+              <w:rPr>
+                <w:rFonts w:ascii="Wingdings 2" w:hAnsi="Wingdings 2" w:cs="Wingdings 2"/>
+                <w:sz w:val="20"/>
+                <w:szCs w:val="20"/>
+                <w:lang w:eastAsia="es-AR"/>
+              </w:rPr>
+              <w:t></w:t>
+            </w:r>
+            <w:r>
+              <w:rPr>
+                <w:rFonts w:ascii="Calibri" w:hAnsi="Calibri" w:cs="Calibri"/>
+                <w:spacing w:val="-4"/>
+                <w:lang w:val="en-US"/>
+              </w:rPr>
+              <w:t xml:space="preserve">  Agilent Technologies</w:t>
+            </w:r>
+          </w:p>
+          <w:p>
+            <w:pPr>
+              <w:autoSpaceDE w:val="0"/>
+              <w:autoSpaceDN w:val="0"/>
+              <w:adjustRightInd w:val="0"/>
+              <w:spacing w:line="360" w:lineRule="auto"/>
+              <w:rPr>
+                <w:rFonts w:ascii="Calibri" w:hAnsi="Calibri" w:cs="Calibri"/>
+                <w:spacing w:val="-4"/>
+                <w:lang w:val="en-US"/>
+              </w:rPr>
+            </w:pPr>
+            <w:proofErr w:type="spellStart"/>
+            <w:r>
+              <w:rPr>
+                <w:rFonts w:ascii="Calibri" w:hAnsi="Calibri" w:cs="Calibri"/>
+                <w:b/>
+                <w:spacing w:val="-4"/>
+                <w:lang w:val="en-US"/>
+              </w:rPr>
+              <w:t>Modelo</w:t>
+            </w:r>
+            <w:proofErr w:type="spellEnd"/>
+            <w:r>
+              <w:rPr>
+                <w:rFonts w:ascii="Calibri" w:hAnsi="Calibri" w:cs="Calibri"/>
+                <w:b/>
+                <w:spacing w:val="-4"/>
+                <w:lang w:val="en-US"/>
+              </w:rPr>
+              <w:t>:</w:t>
+            </w:r>
+            <w:r>
+              <w:rPr>
+                <w:rFonts w:ascii="Calibri" w:hAnsi="Calibri" w:cs="Calibri"/>
+                <w:spacing w:val="-4"/>
+                <w:lang w:val="en-US"/>
+              </w:rPr>
+              <w:t xml:space="preserve">       </w:t>
+            </w:r>
+            <w:r>
+              <w:rPr>
+                <w:rFonts w:ascii="Wingdings 2" w:hAnsi="Wingdings 2" w:cs="Wingdings 2"/>
+                <w:sz w:val="20"/>
+                <w:szCs w:val="20"/>
+                <w:lang w:eastAsia="es-AR"/>
+              </w:rPr>
+              <w:t></w:t>
+            </w:r>
+            <w:r>
+              <w:rPr>
+                <w:rFonts w:ascii="Calibri" w:hAnsi="Calibri" w:cs="Calibri"/>
+                <w:spacing w:val="-4"/>
+                <w:lang w:val="en-US"/>
+              </w:rPr>
+              <w:t xml:space="preserve"> 1100      </w:t>
+            </w:r>
+            <w:r>
+              <w:rPr>
+                <w:rFonts w:ascii="Wingdings 2" w:hAnsi="Wingdings 2" w:cs="Wingdings 2"/>
+                <w:sz w:val="20"/>
+                <w:szCs w:val="20"/>
+                <w:lang w:eastAsia="es-AR"/>
+              </w:rPr>
+              <w:t></w:t>
+            </w:r>
+            <w:r>
+              <w:rPr>
+                <w:rFonts w:ascii="Calibri" w:hAnsi="Calibri" w:cs="Calibri"/>
+                <w:spacing w:val="-4"/>
+                <w:lang w:val="en-US"/>
+              </w:rPr>
+              <w:t xml:space="preserve"> 1120        </w:t>
+            </w:r>
             <w:proofErr w:type="gramStart"/>
             <w:r>
               <w:rPr>
@@ -153,7 +245,7 @@
                 <w:spacing w:val="-4"/>
                 <w:lang w:val="en-US"/>
               </w:rPr>
-              <w:t xml:space="preserve">  Agilent</w:t>
+              <w:t xml:space="preserve">  1200</w:t>
             </w:r>
             <w:proofErr w:type="gramEnd"/>
             <w:r>
@@ -162,34 +254,7 @@
                 <w:spacing w:val="-4"/>
                 <w:lang w:val="en-US"/>
               </w:rPr>
-              <w:t xml:space="preserve"> Technologies</w:t>
-            </w:r>
-          </w:p>
-          <w:p>
-            <w:pPr>
-              <w:autoSpaceDE w:val="0"/>
-              <w:autoSpaceDN w:val="0"/>
-              <w:adjustRightInd w:val="0"/>
-              <w:spacing w:line="360" w:lineRule="auto"/>
-              <w:rPr>
-                <w:rFonts w:ascii="Calibri" w:hAnsi="Calibri" w:cs="Calibri"/>
-                <w:spacing w:val="-4"/>
-              </w:rPr>
-            </w:pPr>
-            <w:r>
-              <w:rPr>
-                <w:rFonts w:ascii="Calibri" w:hAnsi="Calibri" w:cs="Calibri"/>
-                <w:b/>
-                <w:spacing w:val="-4"/>
-              </w:rPr>
-              <w:t>Modelo:</w:t>
-            </w:r>
-            <w:r>
-              <w:rPr>
-                <w:rFonts w:ascii="Calibri" w:hAnsi="Calibri" w:cs="Calibri"/>
-                <w:spacing w:val="-4"/>
-              </w:rPr>
-              <w:t xml:space="preserve">       </w:t>
+              <w:t xml:space="preserve">         </w:t>
             </w:r>
             <w:r>
               <w:rPr>
@@ -204,22 +269,9 @@
               <w:rPr>
                 <w:rFonts w:ascii="Calibri" w:hAnsi="Calibri" w:cs="Calibri"/>
                 <w:spacing w:val="-4"/>
+                <w:lang w:val="en-US"/>
               </w:rPr>
-              <w:t xml:space="preserve"> 1100   </w:t>
-            </w:r>
-            <w:r>
-              <w:rPr>
-                <w:rFonts w:ascii="Calibri" w:hAnsi="Calibri" w:cs="Calibri"/>
-                <w:spacing w:val="-4"/>
-              </w:rPr>
-              <w:t xml:space="preserve"> </w:t>
-            </w:r>
-            <w:r>
-              <w:rPr>
-                <w:rFonts w:ascii="Calibri" w:hAnsi="Calibri" w:cs="Calibri"/>
-                <w:spacing w:val="-4"/>
-              </w:rPr>
-              <w:t xml:space="preserve">  </w:t>
+              <w:t xml:space="preserve">  1220         </w:t>
             </w:r>
             <w:r>
               <w:rPr>
@@ -234,17 +286,10 @@
               <w:rPr>
                 <w:rFonts w:ascii="Calibri" w:hAnsi="Calibri" w:cs="Calibri"/>
                 <w:spacing w:val="-4"/>
+                <w:lang w:val="en-US"/>
               </w:rPr>
-              <w:t xml:space="preserve"> 1120       </w:t>
+              <w:t xml:space="preserve">  1260         </w:t>
             </w:r>
-            <w:r>
-              <w:rPr>
-                <w:rFonts w:ascii="Calibri" w:hAnsi="Calibri" w:cs="Calibri"/>
-                <w:spacing w:val="-4"/>
-              </w:rPr>
-              <w:t xml:space="preserve"> </w:t>
-            </w:r>
-            <w:proofErr w:type="gramStart"/>
             <w:r>
               <w:rPr>
                 <w:rFonts w:ascii="Wingdings 2" w:hAnsi="Wingdings 2" w:cs="Wingdings 2"/>
@@ -258,85 +303,10 @@
               <w:rPr>
                 <w:rFonts w:ascii="Calibri" w:hAnsi="Calibri" w:cs="Calibri"/>
                 <w:spacing w:val="-4"/>
-              </w:rPr>
-              <w:t xml:space="preserve">  1200</w:t>
-            </w:r>
-            <w:proofErr w:type="gramEnd"/>
-            <w:r>
-              <w:rPr>
-                <w:rFonts w:ascii="Calibri" w:hAnsi="Calibri" w:cs="Calibri"/>
-                <w:spacing w:val="-4"/>
-              </w:rPr>
-              <w:t xml:space="preserve">         </w:t>
-            </w:r>
-            <w:proofErr w:type="gramStart"/>
-            <w:r>
-              <w:rPr>
-                <w:rFonts w:ascii="Wingdings 2" w:hAnsi="Wingdings 2" w:cs="Wingdings 2"/>
-                <w:sz w:val="20"/>
-                <w:szCs w:val="20"/>
-                <w:lang w:eastAsia="es-AR"/>
-              </w:rPr>
-              <w:t></w:t>
-            </w:r>
-            <w:r>
-              <w:rPr>
-                <w:rFonts w:ascii="Calibri" w:hAnsi="Calibri" w:cs="Calibri"/>
-                <w:spacing w:val="-4"/>
-              </w:rPr>
-              <w:t xml:space="preserve">  1220</w:t>
-            </w:r>
-            <w:proofErr w:type="gramEnd"/>
-            <w:r>
-              <w:rPr>
-                <w:rFonts w:ascii="Calibri" w:hAnsi="Calibri" w:cs="Calibri"/>
-                <w:spacing w:val="-4"/>
-              </w:rPr>
-              <w:t xml:space="preserve">         </w:t>
-            </w:r>
-            <w:proofErr w:type="gramStart"/>
-            <w:r>
-              <w:rPr>
-                <w:rFonts w:ascii="Wingdings 2" w:hAnsi="Wingdings 2" w:cs="Wingdings 2"/>
-                <w:sz w:val="20"/>
-                <w:szCs w:val="20"/>
-                <w:lang w:eastAsia="es-AR"/>
-              </w:rPr>
-              <w:t></w:t>
-            </w:r>
-            <w:r>
-              <w:rPr>
-                <w:rFonts w:ascii="Calibri" w:hAnsi="Calibri" w:cs="Calibri"/>
-                <w:spacing w:val="-4"/>
-              </w:rPr>
-              <w:t xml:space="preserve">  1260</w:t>
-            </w:r>
-            <w:proofErr w:type="gramEnd"/>
-            <w:r>
-              <w:rPr>
-                <w:rFonts w:ascii="Calibri" w:hAnsi="Calibri" w:cs="Calibri"/>
-                <w:spacing w:val="-4"/>
-              </w:rPr>
-              <w:t xml:space="preserve">         </w:t>
-            </w:r>
-            <w:proofErr w:type="gramStart"/>
-            <w:r>
-              <w:rPr>
-                <w:rFonts w:ascii="Wingdings 2" w:hAnsi="Wingdings 2" w:cs="Wingdings 2"/>
-                <w:sz w:val="20"/>
-                <w:szCs w:val="20"/>
-                <w:lang w:eastAsia="es-AR"/>
-              </w:rPr>
-              <w:t></w:t>
-            </w:r>
-            <w:r>
-              <w:rPr>
-                <w:rFonts w:ascii="Calibri" w:hAnsi="Calibri" w:cs="Calibri"/>
-                <w:spacing w:val="-4"/>
+                <w:lang w:val="en-US"/>
               </w:rPr>
               <w:t xml:space="preserve">  1290</w:t>
             </w:r>
-            <w:proofErr w:type="gramEnd"/>
           </w:p>
           <w:p>
             <w:pPr>
@@ -1270,7 +1240,7 @@
           </mc:Choice>
           <mc:Fallback>
             <w:pict>
-              <v:rect w14:anchorId="03960864" id="2 Rectángulo" o:spid="_x0000_s1026" style="position:absolute;margin-left:374.25pt;margin-top:2.85pt;width:7.5pt;height:7.15pt;z-index:251781120;visibility:visible;mso-wrap-style:square;mso-width-percent:0;mso-wrap-distance-left:9pt;mso-wrap-distance-top:0;mso-wrap-distance-right:9pt;mso-wrap-distance-bottom:0;mso-position-horizontal:absolute;mso-position-horizontal-relative:text;mso-position-vertical:absolute;mso-position-vertical-relative:text;mso-width-percent:0;mso-width-relative:margin;v-text-anchor:middle" o:gfxdata="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" filled="f" strokecolor="black [3213]" strokeweight="1.5pt"/>
+              <v:rect w14:anchorId="7BE585B0" id="2 Rectángulo" o:spid="_x0000_s1026" style="position:absolute;margin-left:374.25pt;margin-top:2.85pt;width:7.5pt;height:7.15pt;z-index:251781120;visibility:visible;mso-wrap-style:square;mso-width-percent:0;mso-wrap-distance-left:9pt;mso-wrap-distance-top:0;mso-wrap-distance-right:9pt;mso-wrap-distance-bottom:0;mso-position-horizontal:absolute;mso-position-horizontal-relative:text;mso-position-vertical:absolute;mso-position-vertical-relative:text;mso-width-percent:0;mso-width-relative:margin;v-text-anchor:middle" o:gfxdata="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" filled="f" strokecolor="black [3213]" strokeweight="1.5pt"/>
             </w:pict>
           </mc:Fallback>
         </mc:AlternateContent>
@@ -2418,7 +2388,7 @@
           </mc:Choice>
           <mc:Fallback>
             <w:pict>
-              <v:rect w14:anchorId="4AEC4B78" id="3 Rectángulo" o:spid="_x0000_s1026" style="position:absolute;margin-left:374.25pt;margin-top:3.7pt;width:7.5pt;height:7.15pt;z-index:251783168;visibility:visible;mso-wrap-style:square;mso-width-percent:0;mso-wrap-distance-left:9pt;mso-wrap-distance-top:0;mso-wrap-distance-right:9pt;mso-wrap-distance-bottom:0;mso-position-horizontal:absolute;mso-position-horizontal-relative:text;mso-position-vertical:absolute;mso-position-vertical-relative:text;mso-width-percent:0;mso-width-relative:margin;v-text-anchor:middle" o:gfxdata="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" filled="f" strokecolor="black [3213]" strokeweight="1.5pt"/>
+              <v:rect w14:anchorId="09A54CA8" id="3 Rectángulo" o:spid="_x0000_s1026" style="position:absolute;margin-left:374.25pt;margin-top:3.7pt;width:7.5pt;height:7.15pt;z-index:251783168;visibility:visible;mso-wrap-style:square;mso-width-percent:0;mso-wrap-distance-left:9pt;mso-wrap-distance-top:0;mso-wrap-distance-right:9pt;mso-wrap-distance-bottom:0;mso-position-horizontal:absolute;mso-position-horizontal-relative:text;mso-position-vertical:absolute;mso-position-vertical-relative:text;mso-width-percent:0;mso-width-relative:margin;v-text-anchor:middle" o:gfxdata="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" filled="f" strokecolor="black [3213]" strokeweight="1.5pt"/>
             </w:pict>
           </mc:Fallback>
         </mc:AlternateContent>
@@ -8710,7 +8680,7 @@
 </file>
 
 <file path=word/endnotes.xml><?xml version="1.0" encoding="utf-8"?>
-<w:endnotes xmlns:wpc="http://schemas.microsoft.com/office/word/2010/wordprocessingCanvas" xmlns:cx="http://schemas.microsoft.com/office/drawing/2014/chartex" xmlns:cx1="http://schemas.microsoft.com/office/drawing/2015/9/8/chartex" xmlns:cx2="http://schemas.microsoft.com/office/drawing/2015/10/21/chartex" xmlns:cx3="http://schemas.microsoft.com/office/drawing/2016/5/9/chartex" xmlns:cx4="http://schemas.microsoft.com/office/drawing/2016/5/10/chartex" xmlns:cx5="http://schemas.microsoft.com/office/drawing/2016/5/11/chartex" xmlns:cx6="http://schemas.microsoft.com/office/drawing/2016/5/12/chartex" xmlns:cx7="http://schemas.microsoft.com/office/drawing/2016/5/13/chartex" xmlns:cx8="http://schemas.microsoft.com/office/drawing/2016/5/14/chartex" xmlns:mc="http://schemas.openxmlformats.org/markup-compatibility/2006" xmlns:aink="http://schemas.microsoft.com/office/drawing/2016/ink" xmlns:am3d="http://schemas.microsoft.com/office/drawing/2017/model3d" xmlns:o="urn:schemas-microsoft-com:office:office" xmlns:oel="http://schemas.microsoft.com/office/2019/extlst" xmlns:r="http://schemas.openxmlformats.org/officeDocument/2006/relationships" xmlns:m="http://schemas.openxmlformats.org/officeDocument/2006/math" xmlns:v="urn:schemas-microsoft-com:vml" xmlns:wp14="http://schemas.microsoft.com/office/word/2010/wordprocessingDrawing" xmlns:wp="http://schemas.openxmlformats.org/drawingml/2006/wordprocessingDrawing" xmlns:w10="urn:schemas-microsoft-com:office:word" xmlns:w="http://schemas.openxmlformats.org/wordprocessingml/2006/main" xmlns:w14="http://schemas.microsoft.com/office/word/2010/wordml" xmlns:w15="http://schemas.microsoft.com/office/word/2012/wordml" xmlns:w16cex="http://schemas.microsoft.com/office/word/2018/wordml/cex" xmlns:w16cid="http://schemas.microsoft.com/office/word/2016/wordml/cid" xmlns:w16="http://schemas.microsoft.com/office/word/2018/wordml" xmlns:w16du="http://schemas.microsoft.com/office/word/2023/wordml/word16du" xmlns:w16sdtdh="http://schemas.microsoft.com/office/word/2020/wordml/sdtdatahash" xmlns:w16sdtfl="http://schemas.microsoft.com/office/word/2024/wordml/sdtformatlock" xmlns:w16se="http://schemas.microsoft.com/office/word/2015/wordml/symex" xmlns:wpg="http://schemas.microsoft.com/office/word/2010/wordprocessingGroup" xmlns:wpi="http://schemas.microsoft.com/office/word/2010/wordprocessingInk" xmlns:wne="http://schemas.microsoft.com/office/word/2006/wordml" xmlns:wps="http://schemas.microsoft.com/office/word/2010/wordprocessingShape" mc:Ignorable="w14 w15 w16se w16cid w16 w16cex w16sdtdh w16sdtfl w16du wp14">
+<w:endnotes xmlns:wpc="http://schemas.microsoft.com/office/word/2010/wordprocessingCanvas" xmlns:cx="http://schemas.microsoft.com/office/drawing/2014/chartex" xmlns:cx1="http://schemas.microsoft.com/office/drawing/2015/9/8/chartex" xmlns:cx2="http://schemas.microsoft.com/office/drawing/2015/10/21/chartex" xmlns:cx3="http://schemas.microsoft.com/office/drawing/2016/5/9/chartex" xmlns:cx4="http://schemas.microsoft.com/office/drawing/2016/5/10/chartex" xmlns:cx5="http://schemas.microsoft.com/office/drawing/2016/5/11/chartex" xmlns:cx6="http://schemas.microsoft.com/office/drawing/2016/5/12/chartex" xmlns:cx7="http://schemas.microsoft.com/office/drawing/2016/5/13/chartex" xmlns:cx8="http://schemas.microsoft.com/office/drawing/2016/5/14/chartex" xmlns:mc="http://schemas.openxmlformats.org/markup-compatibility/2006" xmlns:aink="http://schemas.microsoft.com/office/drawing/2016/ink" xmlns:am3d="http://schemas.microsoft.com/office/drawing/2017/model3d" xmlns:o="urn:schemas-microsoft-com:office:office" xmlns:r="http://schemas.openxmlformats.org/officeDocument/2006/relationships" xmlns:m="http://schemas.openxmlformats.org/officeDocument/2006/math" xmlns:v="urn:schemas-microsoft-com:vml" xmlns:wp14="http://schemas.microsoft.com/office/word/2010/wordprocessingDrawing" xmlns:wp="http://schemas.openxmlformats.org/drawingml/2006/wordprocessingDrawing" xmlns:w10="urn:schemas-microsoft-com:office:word" xmlns:w="http://schemas.openxmlformats.org/wordprocessingml/2006/main" xmlns:w14="http://schemas.microsoft.com/office/word/2010/wordml" xmlns:w15="http://schemas.microsoft.com/office/word/2012/wordml" xmlns:w16cex="http://schemas.microsoft.com/office/word/2018/wordml/cex" xmlns:w16cid="http://schemas.microsoft.com/office/word/2016/wordml/cid" xmlns:w16="http://schemas.microsoft.com/office/word/2018/wordml" xmlns:w16sdtdh="http://schemas.microsoft.com/office/word/2020/wordml/sdtdatahash" xmlns:w16se="http://schemas.microsoft.com/office/word/2015/wordml/symex" xmlns:wpg="http://schemas.microsoft.com/office/word/2010/wordprocessingGroup" xmlns:wpi="http://schemas.microsoft.com/office/word/2010/wordprocessingInk" xmlns:wne="http://schemas.microsoft.com/office/word/2006/wordml" xmlns:wps="http://schemas.microsoft.com/office/word/2010/wordprocessingShape" mc:Ignorable="w14 w15 w16se w16cid w16 w16cex w16sdtdh wp14">
   <w:endnote w:type="separator" w:id="-1">
     <w:p>
       <w:r>
@@ -8729,7 +8699,7 @@
 </file>
 
 <file path=word/footer1.xml><?xml version="1.0" encoding="utf-8"?>
-<w:ftr xmlns:wpc="http://schemas.microsoft.com/office/word/2010/wordprocessingCanvas" xmlns:cx="http://schemas.microsoft.com/office/drawing/2014/chartex" xmlns:cx1="http://schemas.microsoft.com/office/drawing/2015/9/8/chartex" xmlns:cx2="http://schemas.microsoft.com/office/drawing/2015/10/21/chartex" xmlns:cx3="http://schemas.microsoft.com/office/drawing/2016/5/9/chartex" xmlns:cx4="http://schemas.microsoft.com/office/drawing/2016/5/10/chartex" xmlns:cx5="http://schemas.microsoft.com/office/drawing/2016/5/11/chartex" xmlns:cx6="http://schemas.microsoft.com/office/drawing/2016/5/12/chartex" xmlns:cx7="http://schemas.microsoft.com/office/drawing/2016/5/13/chartex" xmlns:cx8="http://schemas.microsoft.com/office/drawing/2016/5/14/chartex" xmlns:mc="http://schemas.openxmlformats.org/markup-compatibility/2006" xmlns:aink="http://schemas.microsoft.com/office/drawing/2016/ink" xmlns:am3d="http://schemas.microsoft.com/office/drawing/2017/model3d" xmlns:o="urn:schemas-microsoft-com:office:office" xmlns:oel="http://schemas.microsoft.com/office/2019/extlst" xmlns:r="http://schemas.openxmlformats.org/officeDocument/2006/relationships" xmlns:m="http://schemas.openxmlformats.org/officeDocument/2006/math" xmlns:v="urn:schemas-microsoft-com:vml" xmlns:wp14="http://schemas.microsoft.com/office/word/2010/wordprocessingDrawing" xmlns:wp="http://schemas.openxmlformats.org/drawingml/2006/wordprocessingDrawing" xmlns:w10="urn:schemas-microsoft-com:office:word" xmlns:w="http://schemas.openxmlformats.org/wordprocessingml/2006/main" xmlns:w14="http://schemas.microsoft.com/office/word/2010/wordml" xmlns:w15="http://schemas.microsoft.com/office/word/2012/wordml" xmlns:w16cex="http://schemas.microsoft.com/office/word/2018/wordml/cex" xmlns:w16cid="http://schemas.microsoft.com/office/word/2016/wordml/cid" xmlns:w16="http://schemas.microsoft.com/office/word/2018/wordml" xmlns:w16du="http://schemas.microsoft.com/office/word/2023/wordml/word16du" xmlns:w16sdtdh="http://schemas.microsoft.com/office/word/2020/wordml/sdtdatahash" xmlns:w16sdtfl="http://schemas.microsoft.com/office/word/2024/wordml/sdtformatlock" xmlns:w16se="http://schemas.microsoft.com/office/word/2015/wordml/symex" xmlns:wpg="http://schemas.microsoft.com/office/word/2010/wordprocessingGroup" xmlns:wpi="http://schemas.microsoft.com/office/word/2010/wordprocessingInk" xmlns:wne="http://schemas.microsoft.com/office/word/2006/wordml" xmlns:wps="http://schemas.microsoft.com/office/word/2010/wordprocessingShape" mc:Ignorable="w14 w15 w16se w16cid w16 w16cex w16sdtdh w16sdtfl w16du wp14">
+<w:ftr xmlns:wpc="http://schemas.microsoft.com/office/word/2010/wordprocessingCanvas" xmlns:cx="http://schemas.microsoft.com/office/drawing/2014/chartex" xmlns:cx1="http://schemas.microsoft.com/office/drawing/2015/9/8/chartex" xmlns:cx2="http://schemas.microsoft.com/office/drawing/2015/10/21/chartex" xmlns:cx3="http://schemas.microsoft.com/office/drawing/2016/5/9/chartex" xmlns:cx4="http://schemas.microsoft.com/office/drawing/2016/5/10/chartex" xmlns:cx5="http://schemas.microsoft.com/office/drawing/2016/5/11/chartex" xmlns:cx6="http://schemas.microsoft.com/office/drawing/2016/5/12/chartex" xmlns:cx7="http://schemas.microsoft.com/office/drawing/2016/5/13/chartex" xmlns:cx8="http://schemas.microsoft.com/office/drawing/2016/5/14/chartex" xmlns:mc="http://schemas.openxmlformats.org/markup-compatibility/2006" xmlns:aink="http://schemas.microsoft.com/office/drawing/2016/ink" xmlns:am3d="http://schemas.microsoft.com/office/drawing/2017/model3d" xmlns:o="urn:schemas-microsoft-com:office:office" xmlns:r="http://schemas.openxmlformats.org/officeDocument/2006/relationships" xmlns:m="http://schemas.openxmlformats.org/officeDocument/2006/math" xmlns:v="urn:schemas-microsoft-com:vml" xmlns:wp14="http://schemas.microsoft.com/office/word/2010/wordprocessingDrawing" xmlns:wp="http://schemas.openxmlformats.org/drawingml/2006/wordprocessingDrawing" xmlns:w10="urn:schemas-microsoft-com:office:word" xmlns:w="http://schemas.openxmlformats.org/wordprocessingml/2006/main" xmlns:w14="http://schemas.microsoft.com/office/word/2010/wordml" xmlns:w15="http://schemas.microsoft.com/office/word/2012/wordml" xmlns:w16cex="http://schemas.microsoft.com/office/word/2018/wordml/cex" xmlns:w16cid="http://schemas.microsoft.com/office/word/2016/wordml/cid" xmlns:w16="http://schemas.microsoft.com/office/word/2018/wordml" xmlns:w16sdtdh="http://schemas.microsoft.com/office/word/2020/wordml/sdtdatahash" xmlns:w16se="http://schemas.microsoft.com/office/word/2015/wordml/symex" xmlns:wpg="http://schemas.microsoft.com/office/word/2010/wordprocessingGroup" xmlns:wpi="http://schemas.microsoft.com/office/word/2010/wordprocessingInk" xmlns:wne="http://schemas.microsoft.com/office/word/2006/wordml" xmlns:wps="http://schemas.microsoft.com/office/word/2010/wordprocessingShape" mc:Ignorable="w14 w15 w16se w16cid w16 w16cex w16sdtdh wp14">
   <w:p>
     <w:pPr>
       <w:pStyle w:val="Piedepgina"/>
@@ -8797,7 +8767,7 @@
         <w:sz w:val="16"/>
         <w:szCs w:val="16"/>
       </w:rPr>
-      <w:t>QF7.0605.06.MP1100-1200-1220-1260-1290</w:t>
+      <w:t>QF7.0605.07 MP1100-1200-1220-1260-1290</w:t>
     </w:r>
     <w:r>
       <w:rPr>
@@ -8916,7 +8886,7 @@
 </file>
 
 <file path=word/footnotes.xml><?xml version="1.0" encoding="utf-8"?>
-<w:footnotes xmlns:wpc="http://schemas.microsoft.com/office/word/2010/wordprocessingCanvas" xmlns:cx="http://schemas.microsoft.com/office/drawing/2014/chartex" xmlns:cx1="http://schemas.microsoft.com/office/drawing/2015/9/8/chartex" xmlns:cx2="http://schemas.microsoft.com/office/drawing/2015/10/21/chartex" xmlns:cx3="http://schemas.microsoft.com/office/drawing/2016/5/9/chartex" xmlns:cx4="http://schemas.microsoft.com/office/drawing/2016/5/10/chartex" xmlns:cx5="http://schemas.microsoft.com/office/drawing/2016/5/11/chartex" xmlns:cx6="http://schemas.microsoft.com/office/drawing/2016/5/12/chartex" xmlns:cx7="http://schemas.microsoft.com/office/drawing/2016/5/13/chartex" xmlns:cx8="http://schemas.microsoft.com/office/drawing/2016/5/14/chartex" xmlns:mc="http://schemas.openxmlformats.org/markup-compatibility/2006" xmlns:aink="http://schemas.microsoft.com/office/drawing/2016/ink" xmlns:am3d="http://schemas.microsoft.com/office/drawing/2017/model3d" xmlns:o="urn:schemas-microsoft-com:office:office" xmlns:oel="http://schemas.microsoft.com/office/2019/extlst" xmlns:r="http://schemas.openxmlformats.org/officeDocument/2006/relationships" xmlns:m="http://schemas.openxmlformats.org/officeDocument/2006/math" xmlns:v="urn:schemas-microsoft-com:vml" xmlns:wp14="http://schemas.microsoft.com/office/word/2010/wordprocessingDrawing" xmlns:wp="http://schemas.openxmlformats.org/drawingml/2006/wordprocessingDrawing" xmlns:w10="urn:schemas-microsoft-com:office:word" xmlns:w="http://schemas.openxmlformats.org/wordprocessingml/2006/main" xmlns:w14="http://schemas.microsoft.com/office/word/2010/wordml" xmlns:w15="http://schemas.microsoft.com/office/word/2012/wordml" xmlns:w16cex="http://schemas.microsoft.com/office/word/2018/wordml/cex" xmlns:w16cid="http://schemas.microsoft.com/office/word/2016/wordml/cid" xmlns:w16="http://schemas.microsoft.com/office/word/2018/wordml" xmlns:w16du="http://schemas.microsoft.com/office/word/2023/wordml/word16du" xmlns:w16sdtdh="http://schemas.microsoft.com/office/word/2020/wordml/sdtdatahash" xmlns:w16sdtfl="http://schemas.microsoft.com/office/word/2024/wordml/sdtformatlock" xmlns:w16se="http://schemas.microsoft.com/office/word/2015/wordml/symex" xmlns:wpg="http://schemas.microsoft.com/office/word/2010/wordprocessingGroup" xmlns:wpi="http://schemas.microsoft.com/office/word/2010/wordprocessingInk" xmlns:wne="http://schemas.microsoft.com/office/word/2006/wordml" xmlns:wps="http://schemas.microsoft.com/office/word/2010/wordprocessingShape" mc:Ignorable="w14 w15 w16se w16cid w16 w16cex w16sdtdh w16sdtfl w16du wp14">
+<w:footnotes xmlns:wpc="http://schemas.microsoft.com/office/word/2010/wordprocessingCanvas" xmlns:cx="http://schemas.microsoft.com/office/drawing/2014/chartex" xmlns:cx1="http://schemas.microsoft.com/office/drawing/2015/9/8/chartex" xmlns:cx2="http://schemas.microsoft.com/office/drawing/2015/10/21/chartex" xmlns:cx3="http://schemas.microsoft.com/office/drawing/2016/5/9/chartex" xmlns:cx4="http://schemas.microsoft.com/office/drawing/2016/5/10/chartex" xmlns:cx5="http://schemas.microsoft.com/office/drawing/2016/5/11/chartex" xmlns:cx6="http://schemas.microsoft.com/office/drawing/2016/5/12/chartex" xmlns:cx7="http://schemas.microsoft.com/office/drawing/2016/5/13/chartex" xmlns:cx8="http://schemas.microsoft.com/office/drawing/2016/5/14/chartex" xmlns:mc="http://schemas.openxmlformats.org/markup-compatibility/2006" xmlns:aink="http://schemas.microsoft.com/office/drawing/2016/ink" xmlns:am3d="http://schemas.microsoft.com/office/drawing/2017/model3d" xmlns:o="urn:schemas-microsoft-com:office:office" xmlns:r="http://schemas.openxmlformats.org/officeDocument/2006/relationships" xmlns:m="http://schemas.openxmlformats.org/officeDocument/2006/math" xmlns:v="urn:schemas-microsoft-com:vml" xmlns:wp14="http://schemas.microsoft.com/office/word/2010/wordprocessingDrawing" xmlns:wp="http://schemas.openxmlformats.org/drawingml/2006/wordprocessingDrawing" xmlns:w10="urn:schemas-microsoft-com:office:word" xmlns:w="http://schemas.openxmlformats.org/wordprocessingml/2006/main" xmlns:w14="http://schemas.microsoft.com/office/word/2010/wordml" xmlns:w15="http://schemas.microsoft.com/office/word/2012/wordml" xmlns:w16cex="http://schemas.microsoft.com/office/word/2018/wordml/cex" xmlns:w16cid="http://schemas.microsoft.com/office/word/2016/wordml/cid" xmlns:w16="http://schemas.microsoft.com/office/word/2018/wordml" xmlns:w16sdtdh="http://schemas.microsoft.com/office/word/2020/wordml/sdtdatahash" xmlns:w16se="http://schemas.microsoft.com/office/word/2015/wordml/symex" xmlns:wpg="http://schemas.microsoft.com/office/word/2010/wordprocessingGroup" xmlns:wpi="http://schemas.microsoft.com/office/word/2010/wordprocessingInk" xmlns:wne="http://schemas.microsoft.com/office/word/2006/wordml" xmlns:wps="http://schemas.microsoft.com/office/word/2010/wordprocessingShape" mc:Ignorable="w14 w15 w16se w16cid w16 w16cex w16sdtdh wp14">
   <w:footnote w:type="separator" w:id="-1">
     <w:p>
       <w:r>
@@ -8935,7 +8905,7 @@
 </file>
 
 <file path=word/header1.xml><?xml version="1.0" encoding="utf-8"?>
-<w:hdr xmlns:wpc="http://schemas.microsoft.com/office/word/2010/wordprocessingCanvas" xmlns:cx="http://schemas.microsoft.com/office/drawing/2014/chartex" xmlns:cx1="http://schemas.microsoft.com/office/drawing/2015/9/8/chartex" xmlns:cx2="http://schemas.microsoft.com/office/drawing/2015/10/21/chartex" xmlns:cx3="http://schemas.microsoft.com/office/drawing/2016/5/9/chartex" xmlns:cx4="http://schemas.microsoft.com/office/drawing/2016/5/10/chartex" xmlns:cx5="http://schemas.microsoft.com/office/drawing/2016/5/11/chartex" xmlns:cx6="http://schemas.microsoft.com/office/drawing/2016/5/12/chartex" xmlns:cx7="http://schemas.microsoft.com/office/drawing/2016/5/13/chartex" xmlns:cx8="http://schemas.microsoft.com/office/drawing/2016/5/14/chartex" xmlns:mc="http://schemas.openxmlformats.org/markup-compatibility/2006" xmlns:aink="http://schemas.microsoft.com/office/drawing/2016/ink" xmlns:am3d="http://schemas.microsoft.com/office/drawing/2017/model3d" xmlns:o="urn:schemas-microsoft-com:office:office" xmlns:oel="http://schemas.microsoft.com/office/2019/extlst" xmlns:r="http://schemas.openxmlformats.org/officeDocument/2006/relationships" xmlns:m="http://schemas.openxmlformats.org/officeDocument/2006/math" xmlns:v="urn:schemas-microsoft-com:vml" xmlns:wp14="http://schemas.microsoft.com/office/word/2010/wordprocessingDrawing" xmlns:wp="http://schemas.openxmlformats.org/drawingml/2006/wordprocessingDrawing" xmlns:w10="urn:schemas-microsoft-com:office:word" xmlns:w="http://schemas.openxmlformats.org/wordprocessingml/2006/main" xmlns:w14="http://schemas.microsoft.com/office/word/2010/wordml" xmlns:w15="http://schemas.microsoft.com/office/word/2012/wordml" xmlns:w16cex="http://schemas.microsoft.com/office/word/2018/wordml/cex" xmlns:w16cid="http://schemas.microsoft.com/office/word/2016/wordml/cid" xmlns:w16="http://schemas.microsoft.com/office/word/2018/wordml" xmlns:w16du="http://schemas.microsoft.com/office/word/2023/wordml/word16du" xmlns:w16sdtdh="http://schemas.microsoft.com/office/word/2020/wordml/sdtdatahash" xmlns:w16sdtfl="http://schemas.microsoft.com/office/word/2024/wordml/sdtformatlock" xmlns:w16se="http://schemas.microsoft.com/office/word/2015/wordml/symex" xmlns:wpg="http://schemas.microsoft.com/office/word/2010/wordprocessingGroup" xmlns:wpi="http://schemas.microsoft.com/office/word/2010/wordprocessingInk" xmlns:wne="http://schemas.microsoft.com/office/word/2006/wordml" xmlns:wps="http://schemas.microsoft.com/office/word/2010/wordprocessingShape" mc:Ignorable="w14 w15 w16se w16cid w16 w16cex w16sdtdh w16sdtfl w16du wp14">
+<w:hdr xmlns:wpc="http://schemas.microsoft.com/office/word/2010/wordprocessingCanvas" xmlns:cx="http://schemas.microsoft.com/office/drawing/2014/chartex" xmlns:cx1="http://schemas.microsoft.com/office/drawing/2015/9/8/chartex" xmlns:cx2="http://schemas.microsoft.com/office/drawing/2015/10/21/chartex" xmlns:cx3="http://schemas.microsoft.com/office/drawing/2016/5/9/chartex" xmlns:cx4="http://schemas.microsoft.com/office/drawing/2016/5/10/chartex" xmlns:cx5="http://schemas.microsoft.com/office/drawing/2016/5/11/chartex" xmlns:cx6="http://schemas.microsoft.com/office/drawing/2016/5/12/chartex" xmlns:cx7="http://schemas.microsoft.com/office/drawing/2016/5/13/chartex" xmlns:cx8="http://schemas.microsoft.com/office/drawing/2016/5/14/chartex" xmlns:mc="http://schemas.openxmlformats.org/markup-compatibility/2006" xmlns:aink="http://schemas.microsoft.com/office/drawing/2016/ink" xmlns:am3d="http://schemas.microsoft.com/office/drawing/2017/model3d" xmlns:o="urn:schemas-microsoft-com:office:office" xmlns:r="http://schemas.openxmlformats.org/officeDocument/2006/relationships" xmlns:m="http://schemas.openxmlformats.org/officeDocument/2006/math" xmlns:v="urn:schemas-microsoft-com:vml" xmlns:wp14="http://schemas.microsoft.com/office/word/2010/wordprocessingDrawing" xmlns:wp="http://schemas.openxmlformats.org/drawingml/2006/wordprocessingDrawing" xmlns:w10="urn:schemas-microsoft-com:office:word" xmlns:w="http://schemas.openxmlformats.org/wordprocessingml/2006/main" xmlns:w14="http://schemas.microsoft.com/office/word/2010/wordml" xmlns:w15="http://schemas.microsoft.com/office/word/2012/wordml" xmlns:w16cex="http://schemas.microsoft.com/office/word/2018/wordml/cex" xmlns:w16cid="http://schemas.microsoft.com/office/word/2016/wordml/cid" xmlns:w16="http://schemas.microsoft.com/office/word/2018/wordml" xmlns:w16sdtdh="http://schemas.microsoft.com/office/word/2020/wordml/sdtdatahash" xmlns:w16se="http://schemas.microsoft.com/office/word/2015/wordml/symex" xmlns:wpg="http://schemas.microsoft.com/office/word/2010/wordprocessingGroup" xmlns:wpi="http://schemas.microsoft.com/office/word/2010/wordprocessingInk" xmlns:wne="http://schemas.microsoft.com/office/word/2006/wordml" xmlns:wps="http://schemas.microsoft.com/office/word/2010/wordprocessingShape" mc:Ignorable="w14 w15 w16se w16cid w16 w16cex w16sdtdh wp14">
   <w:tbl>
     <w:tblPr>
       <w:tblW w:w="0" w:type="auto"/>
@@ -9251,7 +9221,7 @@
 </file>
 
 <file path=word/numbering.xml><?xml version="1.0" encoding="utf-8"?>
-<w:numbering xmlns:wpc="http://schemas.microsoft.com/office/word/2010/wordprocessingCanvas" xmlns:cx="http://schemas.microsoft.com/office/drawing/2014/chartex" xmlns:cx1="http://schemas.microsoft.com/office/drawing/2015/9/8/chartex" xmlns:cx2="http://schemas.microsoft.com/office/drawing/2015/10/21/chartex" xmlns:cx3="http://schemas.microsoft.com/office/drawing/2016/5/9/chartex" xmlns:cx4="http://schemas.microsoft.com/office/drawing/2016/5/10/chartex" xmlns:cx5="http://schemas.microsoft.com/office/drawing/2016/5/11/chartex" xmlns:cx6="http://schemas.microsoft.com/office/drawing/2016/5/12/chartex" xmlns:cx7="http://schemas.microsoft.com/office/drawing/2016/5/13/chartex" xmlns:cx8="http://schemas.microsoft.com/office/drawing/2016/5/14/chartex" xmlns:mc="http://schemas.openxmlformats.org/markup-compatibility/2006" xmlns:aink="http://schemas.microsoft.com/office/drawing/2016/ink" xmlns:am3d="http://schemas.microsoft.com/office/drawing/2017/model3d" xmlns:o="urn:schemas-microsoft-com:office:office" xmlns:oel="http://schemas.microsoft.com/office/2019/extlst" xmlns:r="http://schemas.openxmlformats.org/officeDocument/2006/relationships" xmlns:m="http://schemas.openxmlformats.org/officeDocument/2006/math" xmlns:v="urn:schemas-microsoft-com:vml" xmlns:wp14="http://schemas.microsoft.com/office/word/2010/wordprocessingDrawing" xmlns:wp="http://schemas.openxmlformats.org/drawingml/2006/wordprocessingDrawing" xmlns:w10="urn:schemas-microsoft-com:office:word" xmlns:w="http://schemas.openxmlformats.org/wordprocessingml/2006/main" xmlns:w14="http://schemas.microsoft.com/office/word/2010/wordml" xmlns:w15="http://schemas.microsoft.com/office/word/2012/wordml" xmlns:w16cex="http://schemas.microsoft.com/office/word/2018/wordml/cex" xmlns:w16cid="http://schemas.microsoft.com/office/word/2016/wordml/cid" xmlns:w16="http://schemas.microsoft.com/office/word/2018/wordml" xmlns:w16du="http://schemas.microsoft.com/office/word/2023/wordml/word16du" xmlns:w16sdtdh="http://schemas.microsoft.com/office/word/2020/wordml/sdtdatahash" xmlns:w16sdtfl="http://schemas.microsoft.com/office/word/2024/wordml/sdtformatlock" xmlns:w16se="http://schemas.microsoft.com/office/word/2015/wordml/symex" xmlns:wpg="http://schemas.microsoft.com/office/word/2010/wordprocessingGroup" xmlns:wpi="http://schemas.microsoft.com/office/word/2010/wordprocessingInk" xmlns:wne="http://schemas.microsoft.com/office/word/2006/wordml" xmlns:wps="http://schemas.microsoft.com/office/word/2010/wordprocessingShape" mc:Ignorable="w14 w15 w16se w16cid w16 w16cex w16sdtdh w16sdtfl w16du wp14">
+<w:numbering xmlns:wpc="http://schemas.microsoft.com/office/word/2010/wordprocessingCanvas" xmlns:cx="http://schemas.microsoft.com/office/drawing/2014/chartex" xmlns:cx1="http://schemas.microsoft.com/office/drawing/2015/9/8/chartex" xmlns:cx2="http://schemas.microsoft.com/office/drawing/2015/10/21/chartex" xmlns:cx3="http://schemas.microsoft.com/office/drawing/2016/5/9/chartex" xmlns:cx4="http://schemas.microsoft.com/office/drawing/2016/5/10/chartex" xmlns:cx5="http://schemas.microsoft.com/office/drawing/2016/5/11/chartex" xmlns:cx6="http://schemas.microsoft.com/office/drawing/2016/5/12/chartex" xmlns:cx7="http://schemas.microsoft.com/office/drawing/2016/5/13/chartex" xmlns:cx8="http://schemas.microsoft.com/office/drawing/2016/5/14/chartex" xmlns:mc="http://schemas.openxmlformats.org/markup-compatibility/2006" xmlns:aink="http://schemas.microsoft.com/office/drawing/2016/ink" xmlns:am3d="http://schemas.microsoft.com/office/drawing/2017/model3d" xmlns:o="urn:schemas-microsoft-com:office:office" xmlns:r="http://schemas.openxmlformats.org/officeDocument/2006/relationships" xmlns:m="http://schemas.openxmlformats.org/officeDocument/2006/math" xmlns:v="urn:schemas-microsoft-com:vml" xmlns:wp14="http://schemas.microsoft.com/office/word/2010/wordprocessingDrawing" xmlns:wp="http://schemas.openxmlformats.org/drawingml/2006/wordprocessingDrawing" xmlns:w10="urn:schemas-microsoft-com:office:word" xmlns:w="http://schemas.openxmlformats.org/wordprocessingml/2006/main" xmlns:w14="http://schemas.microsoft.com/office/word/2010/wordml" xmlns:w15="http://schemas.microsoft.com/office/word/2012/wordml" xmlns:w16cex="http://schemas.microsoft.com/office/word/2018/wordml/cex" xmlns:w16cid="http://schemas.microsoft.com/office/word/2016/wordml/cid" xmlns:w16="http://schemas.microsoft.com/office/word/2018/wordml" xmlns:w16sdtdh="http://schemas.microsoft.com/office/word/2020/wordml/sdtdatahash" xmlns:w16se="http://schemas.microsoft.com/office/word/2015/wordml/symex" xmlns:wpg="http://schemas.microsoft.com/office/word/2010/wordprocessingGroup" xmlns:wpi="http://schemas.microsoft.com/office/word/2010/wordprocessingInk" xmlns:wne="http://schemas.microsoft.com/office/word/2006/wordml" xmlns:wps="http://schemas.microsoft.com/office/word/2010/wordprocessingShape" mc:Ignorable="w14 w15 w16se w16cid w16 w16cex w16sdtdh wp14">
   <w:abstractNum w:abstractNumId="0" w15:restartNumberingAfterBreak="0">
     <w:nsid w:val="09774BFB"/>
     <w:multiLevelType w:val="hybridMultilevel"/>
@@ -14277,149 +14247,149 @@
       </w:rPr>
     </w:lvl>
   </w:abstractNum>
-  <w:num w:numId="1" w16cid:durableId="888953257">
+  <w:num w:numId="1">
     <w:abstractNumId w:val="27"/>
   </w:num>
-  <w:num w:numId="2" w16cid:durableId="1297880159">
+  <w:num w:numId="2">
     <w:abstractNumId w:val="21"/>
   </w:num>
-  <w:num w:numId="3" w16cid:durableId="386876222">
+  <w:num w:numId="3">
     <w:abstractNumId w:val="7"/>
   </w:num>
-  <w:num w:numId="4" w16cid:durableId="1186166150">
+  <w:num w:numId="4">
     <w:abstractNumId w:val="33"/>
   </w:num>
-  <w:num w:numId="5" w16cid:durableId="102455506">
+  <w:num w:numId="5">
     <w:abstractNumId w:val="1"/>
   </w:num>
-  <w:num w:numId="6" w16cid:durableId="920484335">
+  <w:num w:numId="6">
     <w:abstractNumId w:val="23"/>
   </w:num>
-  <w:num w:numId="7" w16cid:durableId="86318190">
+  <w:num w:numId="7">
     <w:abstractNumId w:val="8"/>
   </w:num>
-  <w:num w:numId="8" w16cid:durableId="455681407">
+  <w:num w:numId="8">
     <w:abstractNumId w:val="10"/>
   </w:num>
-  <w:num w:numId="9" w16cid:durableId="984434047">
+  <w:num w:numId="9">
     <w:abstractNumId w:val="17"/>
   </w:num>
-  <w:num w:numId="10" w16cid:durableId="1958368963">
+  <w:num w:numId="10">
     <w:abstractNumId w:val="12"/>
   </w:num>
-  <w:num w:numId="11" w16cid:durableId="826627933">
+  <w:num w:numId="11">
     <w:abstractNumId w:val="32"/>
   </w:num>
-  <w:num w:numId="12" w16cid:durableId="42216712">
+  <w:num w:numId="12">
     <w:abstractNumId w:val="36"/>
   </w:num>
-  <w:num w:numId="13" w16cid:durableId="761029139">
+  <w:num w:numId="13">
     <w:abstractNumId w:val="0"/>
   </w:num>
-  <w:num w:numId="14" w16cid:durableId="2015256376">
+  <w:num w:numId="14">
     <w:abstractNumId w:val="24"/>
   </w:num>
-  <w:num w:numId="15" w16cid:durableId="1909151776">
+  <w:num w:numId="15">
     <w:abstractNumId w:val="39"/>
   </w:num>
-  <w:num w:numId="16" w16cid:durableId="287588239">
+  <w:num w:numId="16">
     <w:abstractNumId w:val="18"/>
   </w:num>
-  <w:num w:numId="17" w16cid:durableId="1966694527">
+  <w:num w:numId="17">
     <w:abstractNumId w:val="45"/>
   </w:num>
-  <w:num w:numId="18" w16cid:durableId="1074397195">
+  <w:num w:numId="18">
     <w:abstractNumId w:val="42"/>
   </w:num>
-  <w:num w:numId="19" w16cid:durableId="1861161050">
+  <w:num w:numId="19">
     <w:abstractNumId w:val="6"/>
   </w:num>
-  <w:num w:numId="20" w16cid:durableId="323632613">
+  <w:num w:numId="20">
     <w:abstractNumId w:val="29"/>
   </w:num>
-  <w:num w:numId="21" w16cid:durableId="1228683881">
+  <w:num w:numId="21">
     <w:abstractNumId w:val="26"/>
   </w:num>
-  <w:num w:numId="22" w16cid:durableId="108211436">
+  <w:num w:numId="22">
     <w:abstractNumId w:val="37"/>
   </w:num>
-  <w:num w:numId="23" w16cid:durableId="601960002">
+  <w:num w:numId="23">
     <w:abstractNumId w:val="34"/>
   </w:num>
-  <w:num w:numId="24" w16cid:durableId="1617522882">
+  <w:num w:numId="24">
     <w:abstractNumId w:val="20"/>
   </w:num>
-  <w:num w:numId="25" w16cid:durableId="176582650">
+  <w:num w:numId="25">
     <w:abstractNumId w:val="16"/>
   </w:num>
-  <w:num w:numId="26" w16cid:durableId="334889975">
+  <w:num w:numId="26">
     <w:abstractNumId w:val="38"/>
   </w:num>
-  <w:num w:numId="27" w16cid:durableId="209613410">
+  <w:num w:numId="27">
     <w:abstractNumId w:val="40"/>
   </w:num>
-  <w:num w:numId="28" w16cid:durableId="207498242">
+  <w:num w:numId="28">
     <w:abstractNumId w:val="15"/>
   </w:num>
-  <w:num w:numId="29" w16cid:durableId="896165612">
+  <w:num w:numId="29">
     <w:abstractNumId w:val="28"/>
   </w:num>
-  <w:num w:numId="30" w16cid:durableId="1051536959">
+  <w:num w:numId="30">
     <w:abstractNumId w:val="35"/>
   </w:num>
-  <w:num w:numId="31" w16cid:durableId="992831175">
+  <w:num w:numId="31">
     <w:abstractNumId w:val="25"/>
   </w:num>
-  <w:num w:numId="32" w16cid:durableId="301813636">
+  <w:num w:numId="32">
     <w:abstractNumId w:val="31"/>
   </w:num>
-  <w:num w:numId="33" w16cid:durableId="1093746432">
+  <w:num w:numId="33">
     <w:abstractNumId w:val="9"/>
   </w:num>
-  <w:num w:numId="34" w16cid:durableId="642777677">
+  <w:num w:numId="34">
     <w:abstractNumId w:val="41"/>
   </w:num>
-  <w:num w:numId="35" w16cid:durableId="434133622">
+  <w:num w:numId="35">
     <w:abstractNumId w:val="22"/>
   </w:num>
-  <w:num w:numId="36" w16cid:durableId="2043359290">
+  <w:num w:numId="36">
     <w:abstractNumId w:val="11"/>
   </w:num>
-  <w:num w:numId="37" w16cid:durableId="495347584">
+  <w:num w:numId="37">
     <w:abstractNumId w:val="2"/>
   </w:num>
-  <w:num w:numId="38" w16cid:durableId="1517428372">
+  <w:num w:numId="38">
     <w:abstractNumId w:val="30"/>
   </w:num>
-  <w:num w:numId="39" w16cid:durableId="1841775489">
+  <w:num w:numId="39">
     <w:abstractNumId w:val="13"/>
   </w:num>
-  <w:num w:numId="40" w16cid:durableId="1273590180">
+  <w:num w:numId="40">
     <w:abstractNumId w:val="5"/>
   </w:num>
-  <w:num w:numId="41" w16cid:durableId="1754357981">
+  <w:num w:numId="41">
     <w:abstractNumId w:val="4"/>
   </w:num>
-  <w:num w:numId="42" w16cid:durableId="1648820803">
+  <w:num w:numId="42">
     <w:abstractNumId w:val="44"/>
   </w:num>
-  <w:num w:numId="43" w16cid:durableId="756361701">
+  <w:num w:numId="43">
     <w:abstractNumId w:val="43"/>
   </w:num>
-  <w:num w:numId="44" w16cid:durableId="1775516853">
+  <w:num w:numId="44">
     <w:abstractNumId w:val="14"/>
   </w:num>
-  <w:num w:numId="45" w16cid:durableId="1235698185">
+  <w:num w:numId="45">
     <w:abstractNumId w:val="19"/>
   </w:num>
-  <w:num w:numId="46" w16cid:durableId="257178879">
+  <w:num w:numId="46">
     <w:abstractNumId w:val="3"/>
   </w:num>
 </w:numbering>
 </file>
 
 <file path=word/styles.xml><?xml version="1.0" encoding="utf-8"?>
-<w:styles xmlns:mc="http://schemas.openxmlformats.org/markup-compatibility/2006" xmlns:r="http://schemas.openxmlformats.org/officeDocument/2006/relationships" xmlns:w="http://schemas.openxmlformats.org/wordprocessingml/2006/main" xmlns:w14="http://schemas.microsoft.com/office/word/2010/wordml" xmlns:w15="http://schemas.microsoft.com/office/word/2012/wordml" xmlns:w16cex="http://schemas.microsoft.com/office/word/2018/wordml/cex" xmlns:w16cid="http://schemas.microsoft.com/office/word/2016/wordml/cid" xmlns:w16="http://schemas.microsoft.com/office/word/2018/wordml" xmlns:w16du="http://schemas.microsoft.com/office/word/2023/wordml/word16du" xmlns:w16sdtdh="http://schemas.microsoft.com/office/word/2020/wordml/sdtdatahash" xmlns:w16sdtfl="http://schemas.microsoft.com/office/word/2024/wordml/sdtformatlock" xmlns:w16se="http://schemas.microsoft.com/office/word/2015/wordml/symex" mc:Ignorable="w14 w15 w16se w16cid w16 w16cex w16sdtdh w16sdtfl w16du">
+<w:styles xmlns:mc="http://schemas.openxmlformats.org/markup-compatibility/2006" xmlns:r="http://schemas.openxmlformats.org/officeDocument/2006/relationships" xmlns:w="http://schemas.openxmlformats.org/wordprocessingml/2006/main" xmlns:w14="http://schemas.microsoft.com/office/word/2010/wordml" xmlns:w15="http://schemas.microsoft.com/office/word/2012/wordml" xmlns:w16cex="http://schemas.microsoft.com/office/word/2018/wordml/cex" xmlns:w16cid="http://schemas.microsoft.com/office/word/2016/wordml/cid" xmlns:w16="http://schemas.microsoft.com/office/word/2018/wordml" xmlns:w16sdtdh="http://schemas.microsoft.com/office/word/2020/wordml/sdtdatahash" xmlns:w16se="http://schemas.microsoft.com/office/word/2015/wordml/symex" mc:Ignorable="w14 w15 w16se w16cid w16 w16cex w16sdtdh">
   <w:docDefaults>
     <w:rPrDefault>
       <w:rPr>

</xml_diff>